<commit_message>
updated info with CV
</commit_message>
<xml_diff>
--- a/CV/Resume_khabir_sec.docx
+++ b/CV/Resume_khabir_sec.docx
@@ -1,6 +1,6 @@
 
 <file path=word/document.xml><?xml version="1.0" encoding="utf-8"?>
-<w:document xmlns:wpc="http://schemas.microsoft.com/office/word/2010/wordprocessingCanvas" xmlns:cx="http://schemas.microsoft.com/office/drawing/2014/chartex" xmlns:cx1="http://schemas.microsoft.com/office/drawing/2015/9/8/chartex" xmlns:cx2="http://schemas.microsoft.com/office/drawing/2015/10/21/chartex" xmlns:cx3="http://schemas.microsoft.com/office/drawing/2016/5/9/chartex" xmlns:cx4="http://schemas.microsoft.com/office/drawing/2016/5/10/chartex" xmlns:cx5="http://schemas.microsoft.com/office/drawing/2016/5/11/chartex" xmlns:cx6="http://schemas.microsoft.com/office/drawing/2016/5/12/chartex" xmlns:cx7="http://schemas.microsoft.com/office/drawing/2016/5/13/chartex" xmlns:cx8="http://schemas.microsoft.com/office/drawing/2016/5/14/chartex" xmlns:mc="http://schemas.openxmlformats.org/markup-compatibility/2006" xmlns:aink="http://schemas.microsoft.com/office/drawing/2016/ink" xmlns:am3d="http://schemas.microsoft.com/office/drawing/2017/model3d" xmlns:o="urn:schemas-microsoft-com:office:office" xmlns:oel="http://schemas.microsoft.com/office/2019/extlst" xmlns:r="http://schemas.openxmlformats.org/officeDocument/2006/relationships" xmlns:m="http://schemas.openxmlformats.org/officeDocument/2006/math" xmlns:v="urn:schemas-microsoft-com:vml" xmlns:wp14="http://schemas.microsoft.com/office/word/2010/wordprocessingDrawing" xmlns:wp="http://schemas.openxmlformats.org/drawingml/2006/wordprocessingDrawing" xmlns:w10="urn:schemas-microsoft-com:office:word" xmlns:w="http://schemas.openxmlformats.org/wordprocessingml/2006/main" xmlns:w14="http://schemas.microsoft.com/office/word/2010/wordml" xmlns:w15="http://schemas.microsoft.com/office/word/2012/wordml" xmlns:w16cex="http://schemas.microsoft.com/office/word/2018/wordml/cex" xmlns:w16cid="http://schemas.microsoft.com/office/word/2016/wordml/cid" xmlns:w16="http://schemas.microsoft.com/office/word/2018/wordml" xmlns:w16sdtdh="http://schemas.microsoft.com/office/word/2020/wordml/sdtdatahash" xmlns:w16se="http://schemas.microsoft.com/office/word/2015/wordml/symex" xmlns:wpg="http://schemas.microsoft.com/office/word/2010/wordprocessingGroup" xmlns:wpi="http://schemas.microsoft.com/office/word/2010/wordprocessingInk" xmlns:wne="http://schemas.microsoft.com/office/word/2006/wordml" xmlns:wps="http://schemas.microsoft.com/office/word/2010/wordprocessingShape" mc:Ignorable="w14 w15 w16se w16cid w16 w16cex w16sdtdh wp14">
+<w:document xmlns:wpc="http://schemas.microsoft.com/office/word/2010/wordprocessingCanvas" xmlns:cx="http://schemas.microsoft.com/office/drawing/2014/chartex" xmlns:cx1="http://schemas.microsoft.com/office/drawing/2015/9/8/chartex" xmlns:cx2="http://schemas.microsoft.com/office/drawing/2015/10/21/chartex" xmlns:cx3="http://schemas.microsoft.com/office/drawing/2016/5/9/chartex" xmlns:cx4="http://schemas.microsoft.com/office/drawing/2016/5/10/chartex" xmlns:cx5="http://schemas.microsoft.com/office/drawing/2016/5/11/chartex" xmlns:cx6="http://schemas.microsoft.com/office/drawing/2016/5/12/chartex" xmlns:cx7="http://schemas.microsoft.com/office/drawing/2016/5/13/chartex" xmlns:cx8="http://schemas.microsoft.com/office/drawing/2016/5/14/chartex" xmlns:mc="http://schemas.openxmlformats.org/markup-compatibility/2006" xmlns:m="http://schemas.openxmlformats.org/officeDocument/2006/math" xmlns:aink="http://schemas.microsoft.com/office/drawing/2016/ink" xmlns:am3d="http://schemas.microsoft.com/office/drawing/2017/model3d" xmlns:oel="http://schemas.microsoft.com/office/2019/extlst" xmlns:r="http://schemas.openxmlformats.org/officeDocument/2006/relationships" xmlns:wp14="http://schemas.microsoft.com/office/word/2010/wordprocessingDrawing" xmlns:wp="http://schemas.openxmlformats.org/drawingml/2006/wordprocessingDrawing" xmlns:wpg="http://schemas.microsoft.com/office/word/2010/wordprocessingGroup" xmlns:wpi="http://schemas.microsoft.com/office/word/2010/wordprocessingInk" xmlns:wps="http://schemas.microsoft.com/office/word/2010/wordprocessingShape" xmlns:o="urn:schemas-microsoft-com:office:office" xmlns:v="urn:schemas-microsoft-com:vml" xmlns:w10="urn:schemas-microsoft-com:office:word" xmlns:w="http://schemas.openxmlformats.org/wordprocessingml/2006/main" xmlns:w14="http://schemas.microsoft.com/office/word/2010/wordml" xmlns:w15="http://schemas.microsoft.com/office/word/2012/wordml" xmlns:w16cex="http://schemas.microsoft.com/office/word/2018/wordml/cex" xmlns:w16cid="http://schemas.microsoft.com/office/word/2016/wordml/cid" xmlns:w16="http://schemas.microsoft.com/office/word/2018/wordml" xmlns:w16sdtdh="http://schemas.microsoft.com/office/word/2020/wordml/sdtdatahash" xmlns:w16sdtfl="http://schemas.microsoft.com/office/word/2024/wordml/sdtformatlock" xmlns:w16se="http://schemas.microsoft.com/office/word/2015/wordml/symex" xmlns:w16du="http://schemas.microsoft.com/office/word/2023/wordml/word16du" xmlns:wne="http://schemas.microsoft.com/office/word/2006/wordml" mc:Ignorable="w14 w15 w16se w16cid w16 w16cex w16sdtdh w16sdtfl w16du wp14">
   <w:body>
     <w:p>
       <w:pPr>
@@ -18,28 +18,12 @@
         </w:rPr>
         <w:t xml:space="preserve"> </w:t>
       </w:r>
-      <w:proofErr w:type="spellStart"/>
-      <w:r>
-        <w:rPr>
-          <w:rFonts w:ascii="Comic Sans MS" w:hAnsi="Comic Sans MS"/>
-        </w:rPr>
-        <w:t>Mohammad</w:t>
-      </w:r>
-      <w:proofErr w:type="spellEnd"/>
-      <w:r>
-        <w:rPr>
-          <w:rFonts w:ascii="Comic Sans MS" w:hAnsi="Comic Sans MS"/>
-        </w:rPr>
-        <w:t xml:space="preserve"> Khabir </w:t>
-      </w:r>
-      <w:proofErr w:type="spellStart"/>
-      <w:r>
-        <w:rPr>
-          <w:rFonts w:ascii="Comic Sans MS" w:hAnsi="Comic Sans MS"/>
-        </w:rPr>
-        <w:t>Uddin</w:t>
-      </w:r>
-      <w:proofErr w:type="spellEnd"/>
+      <w:r>
+        <w:rPr>
+          <w:rFonts w:ascii="Comic Sans MS" w:hAnsi="Comic Sans MS"/>
+        </w:rPr>
+        <w:t>Mohammad Khabir Uddin</w:t>
+      </w:r>
     </w:p>
     <w:tbl>
       <w:tblPr>
@@ -92,7 +76,7 @@
                 <w:szCs w:val="20"/>
                 <w:lang w:val="en-GB"/>
               </w:rPr>
-              <w:t>Sokinsuontie</w:t>
+              <w:t>Kirstintie</w:t>
             </w:r>
             <w:proofErr w:type="spellEnd"/>
             <w:r>
@@ -102,7 +86,25 @@
                 <w:szCs w:val="20"/>
                 <w:lang w:val="en-GB"/>
               </w:rPr>
-              <w:t xml:space="preserve"> 7a 13</w:t>
+              <w:t xml:space="preserve"> 16a</w:t>
+            </w:r>
+            <w:r>
+              <w:rPr>
+                <w:rFonts w:ascii="Comic Sans MS" w:hAnsi="Comic Sans MS"/>
+                <w:sz w:val="20"/>
+                <w:szCs w:val="20"/>
+                <w:lang w:val="en-GB"/>
+              </w:rPr>
+              <w:t xml:space="preserve"> </w:t>
+            </w:r>
+            <w:r>
+              <w:rPr>
+                <w:rFonts w:ascii="Comic Sans MS" w:hAnsi="Comic Sans MS"/>
+                <w:sz w:val="20"/>
+                <w:szCs w:val="20"/>
+                <w:lang w:val="en-GB"/>
+              </w:rPr>
+              <w:t>7</w:t>
             </w:r>
             <w:r>
               <w:rPr>
@@ -158,6 +160,7 @@
               </w:rPr>
               <w:br/>
             </w:r>
+            <w:proofErr w:type="gramStart"/>
             <w:r>
               <w:rPr>
                 <w:rFonts w:ascii="Comic Sans MS" w:hAnsi="Comic Sans MS"/>
@@ -174,7 +177,17 @@
                 <w:szCs w:val="20"/>
                 <w:lang w:val="en-US"/>
               </w:rPr>
-              <w:t> : +358 4</w:t>
+              <w:t> :</w:t>
+            </w:r>
+            <w:proofErr w:type="gramEnd"/>
+            <w:r>
+              <w:rPr>
+                <w:rFonts w:ascii="Comic Sans MS" w:hAnsi="Comic Sans MS"/>
+                <w:sz w:val="20"/>
+                <w:szCs w:val="20"/>
+                <w:lang w:val="en-US"/>
+              </w:rPr>
+              <w:t xml:space="preserve"> +358 4</w:t>
             </w:r>
             <w:r>
               <w:rPr>
@@ -229,38 +242,6 @@
                 <w:lang w:val="en-US"/>
               </w:rPr>
             </w:pPr>
-            <w:r>
-              <w:rPr>
-                <w:rFonts w:ascii="Comic Sans MS" w:hAnsi="Comic Sans MS"/>
-                <w:sz w:val="20"/>
-                <w:szCs w:val="20"/>
-                <w:lang w:val="en-US"/>
-              </w:rPr>
-              <w:t xml:space="preserve">Skype: </w:t>
-            </w:r>
-            <w:proofErr w:type="spellStart"/>
-            <w:r>
-              <w:rPr>
-                <w:rFonts w:ascii="Comic Sans MS" w:hAnsi="Comic Sans MS"/>
-                <w:sz w:val="20"/>
-                <w:szCs w:val="20"/>
-                <w:lang w:val="en-US"/>
-              </w:rPr>
-              <w:t>md.khabir.uddin</w:t>
-            </w:r>
-            <w:proofErr w:type="spellEnd"/>
-          </w:p>
-          <w:p>
-            <w:pPr>
-              <w:pStyle w:val="BodyA"/>
-              <w:widowControl w:val="0"/>
-              <w:rPr>
-                <w:rFonts w:ascii="Comic Sans MS" w:eastAsia="Comic Sans MS" w:hAnsi="Comic Sans MS" w:cs="Comic Sans MS"/>
-                <w:sz w:val="20"/>
-                <w:szCs w:val="20"/>
-                <w:lang w:val="en-US"/>
-              </w:rPr>
-            </w:pPr>
             <w:proofErr w:type="spellStart"/>
             <w:r>
               <w:rPr>
@@ -279,7 +260,7 @@
                 <w:szCs w:val="20"/>
                 <w:lang w:val="en-US"/>
               </w:rPr>
-              <w:t xml:space="preserve">: https://github.com/masumndc1/zim         </w:t>
+              <w:t xml:space="preserve">: https://github.com/masumndc1         </w:t>
             </w:r>
           </w:p>
         </w:tc>
@@ -296,6 +277,7 @@
         </w:rPr>
       </w:pPr>
       <w:proofErr w:type="spellStart"/>
+      <w:proofErr w:type="gramStart"/>
       <w:r>
         <w:rPr>
           <w:rFonts w:ascii="Comic Sans MS" w:hAnsi="Comic Sans MS"/>
@@ -311,7 +293,16 @@
           <w:sz w:val="20"/>
           <w:szCs w:val="20"/>
         </w:rPr>
-        <w:t xml:space="preserve"> : https://www.linkedin.com/in/mohammad-khabir-uddin-a9a67114</w:t>
+        <w:t xml:space="preserve"> :</w:t>
+      </w:r>
+      <w:proofErr w:type="gramEnd"/>
+      <w:r>
+        <w:rPr>
+          <w:rFonts w:ascii="Comic Sans MS" w:hAnsi="Comic Sans MS"/>
+          <w:sz w:val="20"/>
+          <w:szCs w:val="20"/>
+        </w:rPr>
+        <w:t xml:space="preserve"> https://www.linkedin.com/in/mohammad-khabir-uddin-a9a67114</w:t>
       </w:r>
     </w:p>
     <w:p>
@@ -772,7 +763,27 @@
           <w:szCs w:val="20"/>
           <w:lang w:val="en-US"/>
         </w:rPr>
-        <w:t xml:space="preserve"> of April, 2019 to till date.</w:t>
+        <w:t xml:space="preserve"> of </w:t>
+      </w:r>
+      <w:proofErr w:type="gramStart"/>
+      <w:r>
+        <w:rPr>
+          <w:rFonts w:ascii="Comic Sans MS" w:hAnsi="Comic Sans MS"/>
+          <w:sz w:val="20"/>
+          <w:szCs w:val="20"/>
+          <w:lang w:val="en-US"/>
+        </w:rPr>
+        <w:t>April,</w:t>
+      </w:r>
+      <w:proofErr w:type="gramEnd"/>
+      <w:r>
+        <w:rPr>
+          <w:rFonts w:ascii="Comic Sans MS" w:hAnsi="Comic Sans MS"/>
+          <w:sz w:val="20"/>
+          <w:szCs w:val="20"/>
+          <w:lang w:val="en-US"/>
+        </w:rPr>
+        <w:t xml:space="preserve"> 2019 to till date.</w:t>
       </w:r>
     </w:p>
     <w:p>
@@ -945,7 +956,27 @@
           <w:szCs w:val="20"/>
           <w:lang w:val="en-US"/>
         </w:rPr>
-        <w:t xml:space="preserve"> of April, 2019</w:t>
+        <w:t xml:space="preserve"> of </w:t>
+      </w:r>
+      <w:proofErr w:type="gramStart"/>
+      <w:r>
+        <w:rPr>
+          <w:rFonts w:ascii="Comic Sans MS" w:hAnsi="Comic Sans MS"/>
+          <w:sz w:val="20"/>
+          <w:szCs w:val="20"/>
+          <w:lang w:val="en-US"/>
+        </w:rPr>
+        <w:t>April,</w:t>
+      </w:r>
+      <w:proofErr w:type="gramEnd"/>
+      <w:r>
+        <w:rPr>
+          <w:rFonts w:ascii="Comic Sans MS" w:hAnsi="Comic Sans MS"/>
+          <w:sz w:val="20"/>
+          <w:szCs w:val="20"/>
+          <w:lang w:val="en-US"/>
+        </w:rPr>
+        <w:t xml:space="preserve"> 2019</w:t>
       </w:r>
       <w:r>
         <w:rPr>
@@ -1063,6 +1094,7 @@
         <w:t xml:space="preserve">Prime Bank </w:t>
       </w:r>
       <w:proofErr w:type="spellStart"/>
+      <w:proofErr w:type="gramStart"/>
       <w:r>
         <w:rPr>
           <w:rFonts w:ascii="Comic Sans MS" w:hAnsi="Comic Sans MS"/>
@@ -1075,6 +1107,7 @@
         <w:t>Limited,Dhaka</w:t>
       </w:r>
       <w:proofErr w:type="spellEnd"/>
+      <w:proofErr w:type="gramEnd"/>
       <w:r>
         <w:rPr>
           <w:rFonts w:ascii="Comic Sans MS" w:hAnsi="Comic Sans MS"/>
@@ -1112,7 +1145,27 @@
           <w:szCs w:val="20"/>
           <w:lang w:val="en-US"/>
         </w:rPr>
-        <w:t xml:space="preserve"> May, 2010 to 15</w:t>
+        <w:t xml:space="preserve"> </w:t>
+      </w:r>
+      <w:proofErr w:type="gramStart"/>
+      <w:r>
+        <w:rPr>
+          <w:rFonts w:ascii="Comic Sans MS" w:hAnsi="Comic Sans MS"/>
+          <w:sz w:val="20"/>
+          <w:szCs w:val="20"/>
+          <w:lang w:val="en-US"/>
+        </w:rPr>
+        <w:t>May,</w:t>
+      </w:r>
+      <w:proofErr w:type="gramEnd"/>
+      <w:r>
+        <w:rPr>
+          <w:rFonts w:ascii="Comic Sans MS" w:hAnsi="Comic Sans MS"/>
+          <w:sz w:val="20"/>
+          <w:szCs w:val="20"/>
+          <w:lang w:val="en-US"/>
+        </w:rPr>
+        <w:t xml:space="preserve"> 2010 to 15</w:t>
       </w:r>
       <w:r>
         <w:rPr>
@@ -1131,7 +1184,27 @@
           <w:szCs w:val="20"/>
           <w:lang w:val="en-US"/>
         </w:rPr>
-        <w:t xml:space="preserve"> May, 2016. Duration: 6 years.</w:t>
+        <w:t xml:space="preserve"> </w:t>
+      </w:r>
+      <w:proofErr w:type="gramStart"/>
+      <w:r>
+        <w:rPr>
+          <w:rFonts w:ascii="Comic Sans MS" w:hAnsi="Comic Sans MS"/>
+          <w:sz w:val="20"/>
+          <w:szCs w:val="20"/>
+          <w:lang w:val="en-US"/>
+        </w:rPr>
+        <w:t>May,</w:t>
+      </w:r>
+      <w:proofErr w:type="gramEnd"/>
+      <w:r>
+        <w:rPr>
+          <w:rFonts w:ascii="Comic Sans MS" w:hAnsi="Comic Sans MS"/>
+          <w:sz w:val="20"/>
+          <w:szCs w:val="20"/>
+          <w:lang w:val="en-US"/>
+        </w:rPr>
+        <w:t xml:space="preserve"> 2016. Duration: 6 years.</w:t>
       </w:r>
     </w:p>
     <w:p>
@@ -1273,7 +1346,27 @@
           <w:szCs w:val="20"/>
           <w:lang w:val="en-US"/>
         </w:rPr>
-        <w:t xml:space="preserve"> May, 2010. Duration: 2 years.</w:t>
+        <w:t xml:space="preserve"> </w:t>
+      </w:r>
+      <w:proofErr w:type="gramStart"/>
+      <w:r>
+        <w:rPr>
+          <w:rFonts w:ascii="Comic Sans MS" w:hAnsi="Comic Sans MS"/>
+          <w:sz w:val="20"/>
+          <w:szCs w:val="20"/>
+          <w:lang w:val="en-US"/>
+        </w:rPr>
+        <w:t>May,</w:t>
+      </w:r>
+      <w:proofErr w:type="gramEnd"/>
+      <w:r>
+        <w:rPr>
+          <w:rFonts w:ascii="Comic Sans MS" w:hAnsi="Comic Sans MS"/>
+          <w:sz w:val="20"/>
+          <w:szCs w:val="20"/>
+          <w:lang w:val="en-US"/>
+        </w:rPr>
+        <w:t xml:space="preserve"> 2010. Duration: 2 years.</w:t>
       </w:r>
     </w:p>
     <w:p>
@@ -1346,7 +1439,64 @@
           <w:szCs w:val="20"/>
           <w:lang w:val="en-US"/>
         </w:rPr>
-        <w:t>September 2019-: Masters in Cyber Security.</w:t>
+        <w:t>June</w:t>
+      </w:r>
+      <w:r>
+        <w:rPr>
+          <w:rFonts w:ascii="Comic Sans MS" w:hAnsi="Comic Sans MS"/>
+          <w:b/>
+          <w:bCs/>
+          <w:sz w:val="20"/>
+          <w:szCs w:val="20"/>
+          <w:lang w:val="en-US"/>
+        </w:rPr>
+        <w:t xml:space="preserve"> </w:t>
+      </w:r>
+      <w:r>
+        <w:rPr>
+          <w:rFonts w:ascii="Comic Sans MS" w:hAnsi="Comic Sans MS"/>
+          <w:b/>
+          <w:bCs/>
+          <w:sz w:val="20"/>
+          <w:szCs w:val="20"/>
+          <w:lang w:val="en-US"/>
+        </w:rPr>
+        <w:t>2025</w:t>
+      </w:r>
+      <w:r>
+        <w:rPr>
+          <w:rFonts w:ascii="Comic Sans MS" w:hAnsi="Comic Sans MS"/>
+          <w:b/>
+          <w:bCs/>
+          <w:sz w:val="20"/>
+          <w:szCs w:val="20"/>
+          <w:lang w:val="en-US"/>
+        </w:rPr>
+        <w:t xml:space="preserve">: </w:t>
+      </w:r>
+      <w:proofErr w:type="gramStart"/>
+      <w:r>
+        <w:rPr>
+          <w:rFonts w:ascii="Comic Sans MS" w:hAnsi="Comic Sans MS"/>
+          <w:b/>
+          <w:bCs/>
+          <w:sz w:val="20"/>
+          <w:szCs w:val="20"/>
+          <w:lang w:val="en-US"/>
+        </w:rPr>
+        <w:t>Masters in Cyber Security</w:t>
+      </w:r>
+      <w:proofErr w:type="gramEnd"/>
+      <w:r>
+        <w:rPr>
+          <w:rFonts w:ascii="Comic Sans MS" w:hAnsi="Comic Sans MS"/>
+          <w:b/>
+          <w:bCs/>
+          <w:sz w:val="20"/>
+          <w:szCs w:val="20"/>
+          <w:lang w:val="en-US"/>
+        </w:rPr>
+        <w:t>.</w:t>
       </w:r>
     </w:p>
     <w:p>
@@ -1550,6 +1700,15 @@
         </w:rPr>
         <w:t>System Administration</w:t>
       </w:r>
+      <w:r>
+        <w:rPr>
+          <w:rFonts w:ascii="Comic Sans MS" w:hAnsi="Comic Sans MS"/>
+          <w:sz w:val="20"/>
+          <w:szCs w:val="20"/>
+          <w:lang w:val="en-US"/>
+        </w:rPr>
+        <w:t>:</w:t>
+      </w:r>
     </w:p>
     <w:p>
       <w:pPr>
@@ -1579,263 +1738,15 @@
           <w:sz w:val="20"/>
           <w:szCs w:val="20"/>
         </w:rPr>
+        <w:t xml:space="preserve"> Linux</w:t>
+      </w:r>
+      <w:r>
+        <w:rPr>
+          <w:rFonts w:ascii="Comic Sans MS" w:hAnsi="Comic Sans MS"/>
+          <w:sz w:val="20"/>
+          <w:szCs w:val="20"/>
+        </w:rPr>
         <w:t xml:space="preserve"> System Administration</w:t>
-      </w:r>
-      <w:r>
-        <w:rPr>
-          <w:rFonts w:ascii="Comic Sans MS" w:hAnsi="Comic Sans MS"/>
-          <w:sz w:val="20"/>
-          <w:szCs w:val="20"/>
-        </w:rPr>
-        <w:t>,</w:t>
-      </w:r>
-      <w:r>
-        <w:rPr>
-          <w:rFonts w:ascii="Comic Sans MS" w:hAnsi="Comic Sans MS"/>
-          <w:sz w:val="20"/>
-          <w:szCs w:val="20"/>
-        </w:rPr>
-        <w:t xml:space="preserve"> package</w:t>
-      </w:r>
-      <w:r>
-        <w:rPr>
-          <w:rFonts w:ascii="Comic Sans MS" w:hAnsi="Comic Sans MS"/>
-          <w:sz w:val="20"/>
-          <w:szCs w:val="20"/>
-        </w:rPr>
-        <w:t xml:space="preserve"> and </w:t>
-      </w:r>
-      <w:r>
-        <w:rPr>
-          <w:rFonts w:ascii="Comic Sans MS" w:hAnsi="Comic Sans MS"/>
-          <w:sz w:val="20"/>
-          <w:szCs w:val="20"/>
-        </w:rPr>
-        <w:t>service management,</w:t>
-      </w:r>
-      <w:r>
-        <w:rPr>
-          <w:rFonts w:ascii="Comic Sans MS" w:hAnsi="Comic Sans MS"/>
-          <w:sz w:val="20"/>
-          <w:szCs w:val="20"/>
-        </w:rPr>
-        <w:t xml:space="preserve"> firewalling</w:t>
-      </w:r>
-      <w:r>
-        <w:rPr>
-          <w:rFonts w:ascii="Comic Sans MS" w:hAnsi="Comic Sans MS"/>
-          <w:b/>
-          <w:bCs/>
-          <w:sz w:val="20"/>
-          <w:szCs w:val="20"/>
-        </w:rPr>
-        <w:t>(</w:t>
-      </w:r>
-      <w:proofErr w:type="spellStart"/>
-      <w:r>
-        <w:rPr>
-          <w:rFonts w:ascii="Comic Sans MS" w:hAnsi="Comic Sans MS"/>
-          <w:b/>
-          <w:bCs/>
-          <w:sz w:val="20"/>
-          <w:szCs w:val="20"/>
-        </w:rPr>
-        <w:t>iptables</w:t>
-      </w:r>
-      <w:r>
-        <w:rPr>
-          <w:rFonts w:ascii="Comic Sans MS" w:hAnsi="Comic Sans MS"/>
-          <w:b/>
-          <w:bCs/>
-          <w:sz w:val="20"/>
-          <w:szCs w:val="20"/>
-        </w:rPr>
-        <w:t>,pf</w:t>
-      </w:r>
-      <w:proofErr w:type="spellEnd"/>
-      <w:r>
-        <w:rPr>
-          <w:rFonts w:ascii="Comic Sans MS" w:hAnsi="Comic Sans MS"/>
-          <w:b/>
-          <w:bCs/>
-          <w:sz w:val="20"/>
-          <w:szCs w:val="20"/>
-        </w:rPr>
-        <w:t>)</w:t>
-      </w:r>
-      <w:r>
-        <w:rPr>
-          <w:rFonts w:ascii="Comic Sans MS" w:hAnsi="Comic Sans MS"/>
-          <w:b/>
-          <w:bCs/>
-          <w:sz w:val="20"/>
-          <w:szCs w:val="20"/>
-        </w:rPr>
-        <w:t xml:space="preserve"> </w:t>
-      </w:r>
-      <w:r>
-        <w:rPr>
-          <w:rFonts w:ascii="Comic Sans MS" w:hAnsi="Comic Sans MS"/>
-          <w:sz w:val="20"/>
-          <w:szCs w:val="20"/>
-        </w:rPr>
-        <w:t xml:space="preserve">on </w:t>
-      </w:r>
-      <w:r>
-        <w:rPr>
-          <w:rFonts w:ascii="Comic Sans MS" w:hAnsi="Comic Sans MS"/>
-          <w:sz w:val="20"/>
-          <w:szCs w:val="20"/>
-        </w:rPr>
-        <w:t>Linux</w:t>
-      </w:r>
-      <w:r>
-        <w:rPr>
-          <w:rFonts w:ascii="Comic Sans MS" w:hAnsi="Comic Sans MS"/>
-          <w:sz w:val="20"/>
-          <w:szCs w:val="20"/>
-        </w:rPr>
-        <w:t xml:space="preserve"> (</w:t>
-      </w:r>
-      <w:r>
-        <w:rPr>
-          <w:rFonts w:ascii="Comic Sans MS" w:hAnsi="Comic Sans MS"/>
-          <w:b/>
-          <w:bCs/>
-          <w:spacing w:val="-5"/>
-          <w:sz w:val="20"/>
-          <w:szCs w:val="20"/>
-        </w:rPr>
-        <w:t>CentOS,</w:t>
-      </w:r>
-      <w:r>
-        <w:rPr>
-          <w:rFonts w:ascii="Comic Sans MS" w:hAnsi="Comic Sans MS"/>
-          <w:b/>
-          <w:bCs/>
-          <w:spacing w:val="-5"/>
-          <w:sz w:val="20"/>
-          <w:szCs w:val="20"/>
-        </w:rPr>
-        <w:t xml:space="preserve"> </w:t>
-      </w:r>
-      <w:r>
-        <w:rPr>
-          <w:rFonts w:ascii="Comic Sans MS" w:hAnsi="Comic Sans MS"/>
-          <w:b/>
-          <w:bCs/>
-          <w:spacing w:val="-5"/>
-          <w:sz w:val="20"/>
-          <w:szCs w:val="20"/>
-        </w:rPr>
-        <w:t>Ubuntu,</w:t>
-      </w:r>
-      <w:r>
-        <w:rPr>
-          <w:rFonts w:ascii="Comic Sans MS" w:hAnsi="Comic Sans MS"/>
-          <w:b/>
-          <w:bCs/>
-          <w:spacing w:val="-5"/>
-          <w:sz w:val="20"/>
-          <w:szCs w:val="20"/>
-        </w:rPr>
-        <w:t xml:space="preserve"> </w:t>
-      </w:r>
-      <w:proofErr w:type="spellStart"/>
-      <w:r>
-        <w:rPr>
-          <w:rFonts w:ascii="Comic Sans MS" w:hAnsi="Comic Sans MS"/>
-          <w:b/>
-          <w:bCs/>
-          <w:spacing w:val="-5"/>
-          <w:sz w:val="20"/>
-          <w:szCs w:val="20"/>
-        </w:rPr>
-        <w:t>Archlinux</w:t>
-      </w:r>
-      <w:proofErr w:type="spellEnd"/>
-      <w:r>
-        <w:rPr>
-          <w:rFonts w:ascii="Comic Sans MS" w:hAnsi="Comic Sans MS"/>
-          <w:b/>
-          <w:bCs/>
-          <w:spacing w:val="-5"/>
-          <w:sz w:val="20"/>
-          <w:szCs w:val="20"/>
-        </w:rPr>
-        <w:t>)</w:t>
-      </w:r>
-      <w:r>
-        <w:rPr>
-          <w:rFonts w:ascii="Comic Sans MS" w:hAnsi="Comic Sans MS"/>
-          <w:b/>
-          <w:bCs/>
-          <w:spacing w:val="-5"/>
-          <w:sz w:val="20"/>
-          <w:szCs w:val="20"/>
-        </w:rPr>
-        <w:t xml:space="preserve"> </w:t>
-      </w:r>
-      <w:r>
-        <w:rPr>
-          <w:rFonts w:ascii="Comic Sans MS" w:hAnsi="Comic Sans MS"/>
-          <w:spacing w:val="-5"/>
-          <w:sz w:val="20"/>
-          <w:szCs w:val="20"/>
-        </w:rPr>
-        <w:t>and</w:t>
-      </w:r>
-      <w:r>
-        <w:rPr>
-          <w:rFonts w:ascii="Comic Sans MS" w:hAnsi="Comic Sans MS"/>
-          <w:b/>
-          <w:bCs/>
-          <w:spacing w:val="-5"/>
-          <w:sz w:val="20"/>
-          <w:szCs w:val="20"/>
-        </w:rPr>
-        <w:t xml:space="preserve"> </w:t>
-      </w:r>
-      <w:r>
-        <w:rPr>
-          <w:rFonts w:ascii="Comic Sans MS" w:hAnsi="Comic Sans MS"/>
-          <w:spacing w:val="-5"/>
-          <w:sz w:val="20"/>
-          <w:szCs w:val="20"/>
-        </w:rPr>
-        <w:t>Unix</w:t>
-      </w:r>
-      <w:r>
-        <w:rPr>
-          <w:rFonts w:ascii="Comic Sans MS" w:hAnsi="Comic Sans MS"/>
-          <w:b/>
-          <w:bCs/>
-          <w:spacing w:val="-5"/>
-          <w:sz w:val="20"/>
-          <w:szCs w:val="20"/>
-        </w:rPr>
-        <w:t xml:space="preserve"> (</w:t>
-      </w:r>
-      <w:r>
-        <w:rPr>
-          <w:rFonts w:ascii="Comic Sans MS" w:hAnsi="Comic Sans MS"/>
-          <w:b/>
-          <w:bCs/>
-          <w:sz w:val="20"/>
-          <w:szCs w:val="20"/>
-        </w:rPr>
-        <w:t>FreeBSD</w:t>
-      </w:r>
-      <w:r>
-        <w:rPr>
-          <w:rFonts w:ascii="Comic Sans MS" w:hAnsi="Comic Sans MS"/>
-          <w:b/>
-          <w:bCs/>
-          <w:spacing w:val="-5"/>
-          <w:sz w:val="20"/>
-          <w:szCs w:val="20"/>
-        </w:rPr>
-        <w:t>)</w:t>
       </w:r>
       <w:r>
         <w:rPr>
@@ -1966,30 +1877,6 @@
         </w:rPr>
         <w:t xml:space="preserve"> </w:t>
       </w:r>
-      <w:proofErr w:type="spellStart"/>
-      <w:r>
-        <w:rPr>
-          <w:rFonts w:ascii="Comic Sans MS" w:hAnsi="Comic Sans MS"/>
-          <w:b/>
-          <w:bCs/>
-          <w:sz w:val="20"/>
-          <w:szCs w:val="20"/>
-          <w:lang w:val="en-US"/>
-        </w:rPr>
-        <w:t>Saltstack</w:t>
-      </w:r>
-      <w:proofErr w:type="spellEnd"/>
-      <w:r>
-        <w:rPr>
-          <w:rFonts w:ascii="Comic Sans MS" w:hAnsi="Comic Sans MS"/>
-          <w:b/>
-          <w:bCs/>
-          <w:sz w:val="20"/>
-          <w:szCs w:val="20"/>
-          <w:lang w:val="en-US"/>
-        </w:rPr>
-        <w:t xml:space="preserve">, </w:t>
-      </w:r>
       <w:r>
         <w:rPr>
           <w:rFonts w:ascii="Comic Sans MS" w:hAnsi="Comic Sans MS"/>
@@ -2140,6 +2027,7 @@
         </w:rPr>
         <w:t xml:space="preserve">Knowledge on CI/CD by using </w:t>
       </w:r>
+      <w:proofErr w:type="spellStart"/>
       <w:r>
         <w:rPr>
           <w:rFonts w:ascii="Comic Sans MS" w:hAnsi="Comic Sans MS"/>
@@ -2149,7 +2037,50 @@
           <w:sz w:val="20"/>
           <w:szCs w:val="20"/>
         </w:rPr>
-        <w:t>Jenkins</w:t>
+        <w:t>Github</w:t>
+      </w:r>
+      <w:proofErr w:type="spellEnd"/>
+      <w:r>
+        <w:rPr>
+          <w:rFonts w:ascii="Comic Sans MS" w:hAnsi="Comic Sans MS"/>
+          <w:b/>
+          <w:bCs/>
+          <w:spacing w:val="-5"/>
+          <w:sz w:val="20"/>
+          <w:szCs w:val="20"/>
+        </w:rPr>
+        <w:t xml:space="preserve"> Action</w:t>
+      </w:r>
+      <w:r>
+        <w:rPr>
+          <w:rFonts w:ascii="Comic Sans MS" w:hAnsi="Comic Sans MS"/>
+          <w:b/>
+          <w:bCs/>
+          <w:spacing w:val="-5"/>
+          <w:sz w:val="20"/>
+          <w:szCs w:val="20"/>
+        </w:rPr>
+        <w:t xml:space="preserve"> </w:t>
+      </w:r>
+      <w:r>
+        <w:rPr>
+          <w:rFonts w:ascii="Comic Sans MS" w:hAnsi="Comic Sans MS"/>
+          <w:spacing w:val="-5"/>
+          <w:sz w:val="20"/>
+          <w:szCs w:val="20"/>
+        </w:rPr>
+        <w:t>and</w:t>
+      </w:r>
+      <w:r>
+        <w:rPr>
+          <w:rFonts w:ascii="Comic Sans MS" w:hAnsi="Comic Sans MS"/>
+          <w:b/>
+          <w:bCs/>
+          <w:spacing w:val="-5"/>
+          <w:sz w:val="20"/>
+          <w:szCs w:val="20"/>
+        </w:rPr>
+        <w:t xml:space="preserve"> Jenkins</w:t>
       </w:r>
       <w:r>
         <w:rPr>
@@ -2177,6 +2108,14 @@
           <w:szCs w:val="20"/>
         </w:rPr>
         <w:t>Cloud</w:t>
+      </w:r>
+      <w:r>
+        <w:rPr>
+          <w:rFonts w:ascii="Comic Sans MS" w:eastAsia="Comic Sans MS" w:hAnsi="Comic Sans MS" w:cs="Comic Sans MS"/>
+          <w:sz w:val="20"/>
+          <w:szCs w:val="20"/>
+        </w:rPr>
+        <w:t>:</w:t>
       </w:r>
     </w:p>
     <w:p>
@@ -2236,6 +2175,7 @@
         <w:t>(</w:t>
       </w:r>
       <w:proofErr w:type="spellStart"/>
+      <w:proofErr w:type="gramStart"/>
       <w:r>
         <w:rPr>
           <w:rFonts w:ascii="Comic Sans MS" w:hAnsi="Comic Sans MS"/>
@@ -2243,9 +2183,48 @@
           <w:sz w:val="20"/>
           <w:szCs w:val="20"/>
         </w:rPr>
-        <w:t>Keystone,glance,rabbitMQ,Nova,Nova</w:t>
+        <w:t>Keystone,</w:t>
+      </w:r>
+      <w:r>
+        <w:rPr>
+          <w:rFonts w:ascii="Comic Sans MS" w:hAnsi="Comic Sans MS"/>
+          <w:spacing w:val="-5"/>
+          <w:sz w:val="20"/>
+          <w:szCs w:val="20"/>
+        </w:rPr>
+        <w:t>Glance</w:t>
+      </w:r>
+      <w:proofErr w:type="gramEnd"/>
+      <w:r>
+        <w:rPr>
+          <w:rFonts w:ascii="Comic Sans MS" w:hAnsi="Comic Sans MS"/>
+          <w:spacing w:val="-5"/>
+          <w:sz w:val="20"/>
+          <w:szCs w:val="20"/>
+        </w:rPr>
+        <w:t>,</w:t>
+      </w:r>
+      <w:proofErr w:type="gramStart"/>
+      <w:r>
+        <w:rPr>
+          <w:rFonts w:ascii="Comic Sans MS" w:hAnsi="Comic Sans MS"/>
+          <w:spacing w:val="-5"/>
+          <w:sz w:val="20"/>
+          <w:szCs w:val="20"/>
+        </w:rPr>
+        <w:t>Nova,</w:t>
+      </w:r>
+      <w:r>
+        <w:rPr>
+          <w:rFonts w:ascii="Comic Sans MS" w:hAnsi="Comic Sans MS"/>
+          <w:spacing w:val="-5"/>
+          <w:sz w:val="20"/>
+          <w:szCs w:val="20"/>
+        </w:rPr>
+        <w:t>Cinder</w:t>
       </w:r>
       <w:proofErr w:type="spellEnd"/>
+      <w:proofErr w:type="gramEnd"/>
       <w:r>
         <w:rPr>
           <w:rFonts w:ascii="Comic Sans MS" w:hAnsi="Comic Sans MS"/>
@@ -2253,7 +2232,7 @@
           <w:sz w:val="20"/>
           <w:szCs w:val="20"/>
         </w:rPr>
-        <w:t>-compute and horizon</w:t>
+        <w:t xml:space="preserve"> and horizon</w:t>
       </w:r>
       <w:r>
         <w:rPr>
@@ -2313,7 +2292,16 @@
           <w:sz w:val="20"/>
           <w:szCs w:val="20"/>
         </w:rPr>
-        <w:t>Containers and orchestration</w:t>
+        <w:t>Containers</w:t>
+      </w:r>
+      <w:r>
+        <w:rPr>
+          <w:rFonts w:ascii="Comic Sans MS" w:hAnsi="Comic Sans MS"/>
+          <w:spacing w:val="-5"/>
+          <w:sz w:val="20"/>
+          <w:szCs w:val="20"/>
+        </w:rPr>
+        <w:t>:</w:t>
       </w:r>
     </w:p>
     <w:p>
@@ -2363,6 +2351,7 @@
         <w:t xml:space="preserve"> and networking using </w:t>
       </w:r>
       <w:proofErr w:type="spellStart"/>
+      <w:proofErr w:type="gramStart"/>
       <w:r>
         <w:rPr>
           <w:rStyle w:val="None"/>
@@ -2387,6 +2376,7 @@
         <w:t>,lxc</w:t>
       </w:r>
       <w:proofErr w:type="spellEnd"/>
+      <w:proofErr w:type="gramEnd"/>
       <w:r>
         <w:rPr>
           <w:rStyle w:val="None"/>
@@ -2399,6 +2389,7 @@
         <w:t>/</w:t>
       </w:r>
       <w:proofErr w:type="spellStart"/>
+      <w:proofErr w:type="gramStart"/>
       <w:r>
         <w:rPr>
           <w:rStyle w:val="None"/>
@@ -2410,29 +2401,30 @@
         </w:rPr>
         <w:t>lxd</w:t>
       </w:r>
+      <w:r>
+        <w:rPr>
+          <w:rStyle w:val="None"/>
+          <w:rFonts w:ascii="Comic Sans MS" w:hAnsi="Comic Sans MS"/>
+          <w:spacing w:val="-5"/>
+          <w:sz w:val="20"/>
+          <w:szCs w:val="20"/>
+        </w:rPr>
+        <w:t>,</w:t>
+      </w:r>
+      <w:r>
+        <w:rPr>
+          <w:rStyle w:val="None"/>
+          <w:rFonts w:ascii="Comic Sans MS" w:hAnsi="Comic Sans MS"/>
+          <w:b/>
+          <w:bCs/>
+          <w:spacing w:val="-5"/>
+          <w:sz w:val="20"/>
+          <w:szCs w:val="20"/>
+        </w:rPr>
+        <w:t>Incus</w:t>
+      </w:r>
       <w:proofErr w:type="spellEnd"/>
-      <w:r>
-        <w:rPr>
-          <w:rStyle w:val="None"/>
-          <w:rFonts w:ascii="Comic Sans MS" w:hAnsi="Comic Sans MS"/>
-          <w:spacing w:val="-5"/>
-          <w:sz w:val="20"/>
-          <w:szCs w:val="20"/>
-        </w:rPr>
-        <w:t xml:space="preserve"> and </w:t>
-      </w:r>
-      <w:r>
-        <w:rPr>
-          <w:rStyle w:val="None"/>
-          <w:rFonts w:ascii="Comic Sans MS" w:hAnsi="Comic Sans MS"/>
-          <w:b/>
-          <w:bCs/>
-          <w:spacing w:val="-5"/>
-          <w:sz w:val="20"/>
-          <w:szCs w:val="20"/>
-        </w:rPr>
-        <w:t>Kubernetes</w:t>
-      </w:r>
+      <w:proofErr w:type="gramEnd"/>
       <w:r>
         <w:rPr>
           <w:rStyle w:val="None"/>
@@ -2462,6 +2454,15 @@
           <w:szCs w:val="20"/>
         </w:rPr>
         <w:t>Virtualization</w:t>
+      </w:r>
+      <w:r>
+        <w:rPr>
+          <w:rFonts w:ascii="Comic Sans MS" w:hAnsi="Comic Sans MS"/>
+          <w:spacing w:val="-5"/>
+          <w:sz w:val="20"/>
+          <w:szCs w:val="20"/>
+        </w:rPr>
+        <w:t>:</w:t>
       </w:r>
     </w:p>
     <w:p>
@@ -2600,6 +2601,14 @@
         </w:rPr>
         <w:t>Perimeter Security</w:t>
       </w:r>
+      <w:r>
+        <w:rPr>
+          <w:rFonts w:ascii="Comic Sans MS" w:eastAsia="Comic Sans MS" w:hAnsi="Comic Sans MS" w:cs="Comic Sans MS"/>
+          <w:sz w:val="20"/>
+          <w:szCs w:val="20"/>
+        </w:rPr>
+        <w:t>:</w:t>
+      </w:r>
     </w:p>
     <w:p>
       <w:pPr>
@@ -2628,74 +2637,45 @@
           <w:sz w:val="20"/>
           <w:szCs w:val="20"/>
         </w:rPr>
-        <w:t>Perimeter security by various firewall devices</w:t>
-      </w:r>
-      <w:r>
-        <w:rPr>
-          <w:rFonts w:ascii="Comic Sans MS" w:hAnsi="Comic Sans MS"/>
-          <w:b/>
-          <w:bCs/>
-          <w:sz w:val="20"/>
-          <w:szCs w:val="20"/>
-        </w:rPr>
-        <w:t xml:space="preserve"> </w:t>
+        <w:t xml:space="preserve">Perimeter </w:t>
+      </w:r>
+      <w:r>
+        <w:rPr>
+          <w:rFonts w:ascii="Comic Sans MS" w:hAnsi="Comic Sans MS"/>
+          <w:sz w:val="20"/>
+          <w:szCs w:val="20"/>
+        </w:rPr>
+        <w:t>S</w:t>
+      </w:r>
+      <w:r>
+        <w:rPr>
+          <w:rFonts w:ascii="Comic Sans MS" w:hAnsi="Comic Sans MS"/>
+          <w:sz w:val="20"/>
+          <w:szCs w:val="20"/>
+        </w:rPr>
+        <w:t xml:space="preserve">ecurity by </w:t>
+      </w:r>
+      <w:r>
+        <w:rPr>
+          <w:rFonts w:ascii="Comic Sans MS" w:hAnsi="Comic Sans MS"/>
+          <w:sz w:val="20"/>
+          <w:szCs w:val="20"/>
+        </w:rPr>
+        <w:t xml:space="preserve">Iptables, </w:t>
       </w:r>
       <w:proofErr w:type="spellStart"/>
       <w:r>
         <w:rPr>
           <w:rFonts w:ascii="Comic Sans MS" w:hAnsi="Comic Sans MS"/>
-          <w:b/>
-          <w:bCs/>
-          <w:sz w:val="20"/>
-          <w:szCs w:val="20"/>
-        </w:rPr>
-        <w:t>Paloalto</w:t>
+          <w:sz w:val="20"/>
+          <w:szCs w:val="20"/>
+        </w:rPr>
+        <w:t>Firewalld</w:t>
       </w:r>
       <w:proofErr w:type="spellEnd"/>
       <w:r>
         <w:rPr>
           <w:rFonts w:ascii="Comic Sans MS" w:hAnsi="Comic Sans MS"/>
-          <w:b/>
-          <w:bCs/>
-          <w:sz w:val="20"/>
-          <w:szCs w:val="20"/>
-        </w:rPr>
-        <w:t>, Cisco ASA, Juniper SRX</w:t>
-      </w:r>
-      <w:r>
-        <w:rPr>
-          <w:rFonts w:ascii="Comic Sans MS" w:hAnsi="Comic Sans MS"/>
-          <w:b/>
-          <w:bCs/>
-          <w:sz w:val="20"/>
-          <w:szCs w:val="20"/>
-        </w:rPr>
-        <w:t xml:space="preserve"> </w:t>
-      </w:r>
-      <w:r>
-        <w:rPr>
-          <w:rFonts w:ascii="Comic Sans MS" w:hAnsi="Comic Sans MS"/>
-          <w:bCs/>
-          <w:sz w:val="20"/>
-          <w:szCs w:val="20"/>
-        </w:rPr>
-        <w:t>etc</w:t>
-      </w:r>
-      <w:r>
-        <w:rPr>
-          <w:rFonts w:ascii="Comic Sans MS" w:hAnsi="Comic Sans MS"/>
-          <w:b/>
-          <w:bCs/>
-          <w:sz w:val="20"/>
-          <w:szCs w:val="20"/>
-        </w:rPr>
-        <w:t xml:space="preserve"> </w:t>
-      </w:r>
-      <w:r>
-        <w:rPr>
-          <w:rFonts w:ascii="Comic Sans MS" w:hAnsi="Comic Sans MS"/>
-          <w:b/>
-          <w:bCs/>
           <w:sz w:val="20"/>
           <w:szCs w:val="20"/>
         </w:rPr>
@@ -2722,6 +2702,16 @@
           <w:lang w:val="en-US"/>
         </w:rPr>
         <w:t>Security</w:t>
+      </w:r>
+      <w:r>
+        <w:rPr>
+          <w:rFonts w:ascii="Comic Sans MS" w:hAnsi="Comic Sans MS"/>
+          <w:spacing w:val="-5"/>
+          <w:sz w:val="20"/>
+          <w:szCs w:val="20"/>
+          <w:lang w:val="en-US"/>
+        </w:rPr>
+        <w:t>:</w:t>
       </w:r>
     </w:p>
     <w:p>
@@ -2812,6 +2802,7 @@
         <w:t>lysis (</w:t>
       </w:r>
       <w:proofErr w:type="spellStart"/>
+      <w:proofErr w:type="gramStart"/>
       <w:r>
         <w:rPr>
           <w:rFonts w:ascii="Comic Sans MS" w:hAnsi="Comic Sans MS"/>
@@ -2833,6 +2824,7 @@
         <w:t>tcpdump</w:t>
       </w:r>
       <w:proofErr w:type="spellEnd"/>
+      <w:proofErr w:type="gramEnd"/>
       <w:r>
         <w:rPr>
           <w:rFonts w:ascii="Comic Sans MS" w:hAnsi="Comic Sans MS"/>
@@ -2897,7 +2889,25 @@
           <w:sz w:val="20"/>
           <w:szCs w:val="20"/>
         </w:rPr>
-        <w:t>, Log analysis(</w:t>
+        <w:t xml:space="preserve">, </w:t>
+      </w:r>
+      <w:r>
+        <w:rPr>
+          <w:rFonts w:ascii="Comic Sans MS" w:hAnsi="Comic Sans MS"/>
+          <w:b/>
+          <w:bCs/>
+          <w:sz w:val="20"/>
+          <w:szCs w:val="20"/>
+        </w:rPr>
+        <w:t>SIEM</w:t>
+      </w:r>
+      <w:r>
+        <w:rPr>
+          <w:rFonts w:ascii="Comic Sans MS" w:hAnsi="Comic Sans MS"/>
+          <w:sz w:val="20"/>
+          <w:szCs w:val="20"/>
+        </w:rPr>
+        <w:t>(</w:t>
       </w:r>
       <w:r>
         <w:rPr>
@@ -2942,37 +2952,41 @@
         <w:t>other security tools (</w:t>
       </w:r>
       <w:proofErr w:type="spellStart"/>
-      <w:r>
-        <w:rPr>
-          <w:rFonts w:ascii="Comic Sans MS" w:hAnsi="Comic Sans MS"/>
-          <w:b/>
-          <w:bCs/>
-          <w:sz w:val="20"/>
-          <w:szCs w:val="20"/>
-        </w:rPr>
-        <w:t>Nmap,Nessus,OpenVAS,Metasploit,</w:t>
-      </w:r>
-      <w:r>
-        <w:rPr>
-          <w:rFonts w:ascii="Comic Sans MS" w:hAnsi="Comic Sans MS"/>
-          <w:b/>
-          <w:bCs/>
-          <w:sz w:val="20"/>
-          <w:szCs w:val="20"/>
-        </w:rPr>
-        <w:t>Burp</w:t>
-      </w:r>
-      <w:r>
-        <w:rPr>
-          <w:rFonts w:ascii="Comic Sans MS" w:hAnsi="Comic Sans MS"/>
-          <w:b/>
-          <w:bCs/>
-          <w:sz w:val="20"/>
-          <w:szCs w:val="20"/>
-        </w:rPr>
-        <w:t>suit</w:t>
+      <w:proofErr w:type="gramStart"/>
+      <w:r>
+        <w:rPr>
+          <w:rFonts w:ascii="Comic Sans MS" w:hAnsi="Comic Sans MS"/>
+          <w:b/>
+          <w:bCs/>
+          <w:sz w:val="20"/>
+          <w:szCs w:val="20"/>
+        </w:rPr>
+        <w:t>Nmap,Nessus</w:t>
+      </w:r>
+      <w:proofErr w:type="gramEnd"/>
+      <w:r>
+        <w:rPr>
+          <w:rFonts w:ascii="Comic Sans MS" w:hAnsi="Comic Sans MS"/>
+          <w:b/>
+          <w:bCs/>
+          <w:sz w:val="20"/>
+          <w:szCs w:val="20"/>
+        </w:rPr>
+        <w:t>,</w:t>
+      </w:r>
+      <w:proofErr w:type="gramStart"/>
+      <w:r>
+        <w:rPr>
+          <w:rFonts w:ascii="Comic Sans MS" w:hAnsi="Comic Sans MS"/>
+          <w:b/>
+          <w:bCs/>
+          <w:sz w:val="20"/>
+          <w:szCs w:val="20"/>
+        </w:rPr>
+        <w:t>OpenVAS,Metasploit</w:t>
       </w:r>
       <w:proofErr w:type="spellEnd"/>
+      <w:proofErr w:type="gramEnd"/>
       <w:r>
         <w:rPr>
           <w:rFonts w:ascii="Comic Sans MS" w:hAnsi="Comic Sans MS"/>
@@ -3013,16 +3027,6 @@
         <w:t>KaliLinux</w:t>
       </w:r>
       <w:proofErr w:type="spellEnd"/>
-      <w:r>
-        <w:rPr>
-          <w:rFonts w:ascii="Comic Sans MS" w:hAnsi="Comic Sans MS"/>
-          <w:b/>
-          <w:bCs/>
-          <w:sz w:val="20"/>
-          <w:szCs w:val="20"/>
-        </w:rPr>
-        <w:t>/Parrot</w:t>
-      </w:r>
       <w:r>
         <w:rPr>
           <w:rFonts w:ascii="Comic Sans MS" w:hAnsi="Comic Sans MS"/>
@@ -3048,6 +3052,14 @@
           <w:szCs w:val="20"/>
         </w:rPr>
         <w:t>Monitoring</w:t>
+      </w:r>
+      <w:r>
+        <w:rPr>
+          <w:rFonts w:ascii="Comic Sans MS" w:eastAsia="Comic Sans MS" w:hAnsi="Comic Sans MS" w:cs="Comic Sans MS"/>
+          <w:sz w:val="20"/>
+          <w:szCs w:val="20"/>
+        </w:rPr>
+        <w:t>:</w:t>
       </w:r>
     </w:p>
     <w:p>
@@ -3083,7 +3095,7 @@
 </file>
 
 <file path=word/endnotes.xml><?xml version="1.0" encoding="utf-8"?>
-<w:endnotes xmlns:wpc="http://schemas.microsoft.com/office/word/2010/wordprocessingCanvas" xmlns:cx="http://schemas.microsoft.com/office/drawing/2014/chartex" xmlns:cx1="http://schemas.microsoft.com/office/drawing/2015/9/8/chartex" xmlns:cx2="http://schemas.microsoft.com/office/drawing/2015/10/21/chartex" xmlns:cx3="http://schemas.microsoft.com/office/drawing/2016/5/9/chartex" xmlns:cx4="http://schemas.microsoft.com/office/drawing/2016/5/10/chartex" xmlns:cx5="http://schemas.microsoft.com/office/drawing/2016/5/11/chartex" xmlns:cx6="http://schemas.microsoft.com/office/drawing/2016/5/12/chartex" xmlns:cx7="http://schemas.microsoft.com/office/drawing/2016/5/13/chartex" xmlns:cx8="http://schemas.microsoft.com/office/drawing/2016/5/14/chartex" xmlns:mc="http://schemas.openxmlformats.org/markup-compatibility/2006" xmlns:aink="http://schemas.microsoft.com/office/drawing/2016/ink" xmlns:am3d="http://schemas.microsoft.com/office/drawing/2017/model3d" xmlns:o="urn:schemas-microsoft-com:office:office" xmlns:oel="http://schemas.microsoft.com/office/2019/extlst" xmlns:r="http://schemas.openxmlformats.org/officeDocument/2006/relationships" xmlns:m="http://schemas.openxmlformats.org/officeDocument/2006/math" xmlns:v="urn:schemas-microsoft-com:vml" xmlns:wp14="http://schemas.microsoft.com/office/word/2010/wordprocessingDrawing" xmlns:wp="http://schemas.openxmlformats.org/drawingml/2006/wordprocessingDrawing" xmlns:w10="urn:schemas-microsoft-com:office:word" xmlns:w="http://schemas.openxmlformats.org/wordprocessingml/2006/main" xmlns:w14="http://schemas.microsoft.com/office/word/2010/wordml" xmlns:w15="http://schemas.microsoft.com/office/word/2012/wordml" xmlns:w16cex="http://schemas.microsoft.com/office/word/2018/wordml/cex" xmlns:w16cid="http://schemas.microsoft.com/office/word/2016/wordml/cid" xmlns:w16="http://schemas.microsoft.com/office/word/2018/wordml" xmlns:w16sdtdh="http://schemas.microsoft.com/office/word/2020/wordml/sdtdatahash" xmlns:w16se="http://schemas.microsoft.com/office/word/2015/wordml/symex" xmlns:wpg="http://schemas.microsoft.com/office/word/2010/wordprocessingGroup" xmlns:wpi="http://schemas.microsoft.com/office/word/2010/wordprocessingInk" xmlns:wne="http://schemas.microsoft.com/office/word/2006/wordml" xmlns:wps="http://schemas.microsoft.com/office/word/2010/wordprocessingShape" mc:Ignorable="w14 w15 w16se w16cid w16 w16cex w16sdtdh wp14">
+<w:endnotes xmlns:wpc="http://schemas.microsoft.com/office/word/2010/wordprocessingCanvas" xmlns:cx="http://schemas.microsoft.com/office/drawing/2014/chartex" xmlns:cx1="http://schemas.microsoft.com/office/drawing/2015/9/8/chartex" xmlns:cx2="http://schemas.microsoft.com/office/drawing/2015/10/21/chartex" xmlns:cx3="http://schemas.microsoft.com/office/drawing/2016/5/9/chartex" xmlns:cx4="http://schemas.microsoft.com/office/drawing/2016/5/10/chartex" xmlns:cx5="http://schemas.microsoft.com/office/drawing/2016/5/11/chartex" xmlns:cx6="http://schemas.microsoft.com/office/drawing/2016/5/12/chartex" xmlns:cx7="http://schemas.microsoft.com/office/drawing/2016/5/13/chartex" xmlns:cx8="http://schemas.microsoft.com/office/drawing/2016/5/14/chartex" xmlns:mc="http://schemas.openxmlformats.org/markup-compatibility/2006" xmlns:m="http://schemas.openxmlformats.org/officeDocument/2006/math" xmlns:aink="http://schemas.microsoft.com/office/drawing/2016/ink" xmlns:am3d="http://schemas.microsoft.com/office/drawing/2017/model3d" xmlns:oel="http://schemas.microsoft.com/office/2019/extlst" xmlns:r="http://schemas.openxmlformats.org/officeDocument/2006/relationships" xmlns:wp14="http://schemas.microsoft.com/office/word/2010/wordprocessingDrawing" xmlns:wp="http://schemas.openxmlformats.org/drawingml/2006/wordprocessingDrawing" xmlns:wpg="http://schemas.microsoft.com/office/word/2010/wordprocessingGroup" xmlns:wpi="http://schemas.microsoft.com/office/word/2010/wordprocessingInk" xmlns:wps="http://schemas.microsoft.com/office/word/2010/wordprocessingShape" xmlns:o="urn:schemas-microsoft-com:office:office" xmlns:v="urn:schemas-microsoft-com:vml" xmlns:w10="urn:schemas-microsoft-com:office:word" xmlns:w="http://schemas.openxmlformats.org/wordprocessingml/2006/main" xmlns:w14="http://schemas.microsoft.com/office/word/2010/wordml" xmlns:w15="http://schemas.microsoft.com/office/word/2012/wordml" xmlns:w16cex="http://schemas.microsoft.com/office/word/2018/wordml/cex" xmlns:w16cid="http://schemas.microsoft.com/office/word/2016/wordml/cid" xmlns:w16="http://schemas.microsoft.com/office/word/2018/wordml" xmlns:w16sdtdh="http://schemas.microsoft.com/office/word/2020/wordml/sdtdatahash" xmlns:w16sdtfl="http://schemas.microsoft.com/office/word/2024/wordml/sdtformatlock" xmlns:w16se="http://schemas.microsoft.com/office/word/2015/wordml/symex" xmlns:w16du="http://schemas.microsoft.com/office/word/2023/wordml/word16du" xmlns:wne="http://schemas.microsoft.com/office/word/2006/wordml" mc:Ignorable="w14 w15 w16se w16cid w16 w16cex w16sdtdh w16sdtfl w16du wp14">
   <w:endnote w:type="separator" w:id="-1">
     <w:p>
       <w:r>
@@ -3102,7 +3114,7 @@
 </file>
 
 <file path=word/footnotes.xml><?xml version="1.0" encoding="utf-8"?>
-<w:footnotes xmlns:wpc="http://schemas.microsoft.com/office/word/2010/wordprocessingCanvas" xmlns:cx="http://schemas.microsoft.com/office/drawing/2014/chartex" xmlns:cx1="http://schemas.microsoft.com/office/drawing/2015/9/8/chartex" xmlns:cx2="http://schemas.microsoft.com/office/drawing/2015/10/21/chartex" xmlns:cx3="http://schemas.microsoft.com/office/drawing/2016/5/9/chartex" xmlns:cx4="http://schemas.microsoft.com/office/drawing/2016/5/10/chartex" xmlns:cx5="http://schemas.microsoft.com/office/drawing/2016/5/11/chartex" xmlns:cx6="http://schemas.microsoft.com/office/drawing/2016/5/12/chartex" xmlns:cx7="http://schemas.microsoft.com/office/drawing/2016/5/13/chartex" xmlns:cx8="http://schemas.microsoft.com/office/drawing/2016/5/14/chartex" xmlns:mc="http://schemas.openxmlformats.org/markup-compatibility/2006" xmlns:aink="http://schemas.microsoft.com/office/drawing/2016/ink" xmlns:am3d="http://schemas.microsoft.com/office/drawing/2017/model3d" xmlns:o="urn:schemas-microsoft-com:office:office" xmlns:oel="http://schemas.microsoft.com/office/2019/extlst" xmlns:r="http://schemas.openxmlformats.org/officeDocument/2006/relationships" xmlns:m="http://schemas.openxmlformats.org/officeDocument/2006/math" xmlns:v="urn:schemas-microsoft-com:vml" xmlns:wp14="http://schemas.microsoft.com/office/word/2010/wordprocessingDrawing" xmlns:wp="http://schemas.openxmlformats.org/drawingml/2006/wordprocessingDrawing" xmlns:w10="urn:schemas-microsoft-com:office:word" xmlns:w="http://schemas.openxmlformats.org/wordprocessingml/2006/main" xmlns:w14="http://schemas.microsoft.com/office/word/2010/wordml" xmlns:w15="http://schemas.microsoft.com/office/word/2012/wordml" xmlns:w16cex="http://schemas.microsoft.com/office/word/2018/wordml/cex" xmlns:w16cid="http://schemas.microsoft.com/office/word/2016/wordml/cid" xmlns:w16="http://schemas.microsoft.com/office/word/2018/wordml" xmlns:w16sdtdh="http://schemas.microsoft.com/office/word/2020/wordml/sdtdatahash" xmlns:w16se="http://schemas.microsoft.com/office/word/2015/wordml/symex" xmlns:wpg="http://schemas.microsoft.com/office/word/2010/wordprocessingGroup" xmlns:wpi="http://schemas.microsoft.com/office/word/2010/wordprocessingInk" xmlns:wne="http://schemas.microsoft.com/office/word/2006/wordml" xmlns:wps="http://schemas.microsoft.com/office/word/2010/wordprocessingShape" mc:Ignorable="w14 w15 w16se w16cid w16 w16cex w16sdtdh wp14">
+<w:footnotes xmlns:wpc="http://schemas.microsoft.com/office/word/2010/wordprocessingCanvas" xmlns:cx="http://schemas.microsoft.com/office/drawing/2014/chartex" xmlns:cx1="http://schemas.microsoft.com/office/drawing/2015/9/8/chartex" xmlns:cx2="http://schemas.microsoft.com/office/drawing/2015/10/21/chartex" xmlns:cx3="http://schemas.microsoft.com/office/drawing/2016/5/9/chartex" xmlns:cx4="http://schemas.microsoft.com/office/drawing/2016/5/10/chartex" xmlns:cx5="http://schemas.microsoft.com/office/drawing/2016/5/11/chartex" xmlns:cx6="http://schemas.microsoft.com/office/drawing/2016/5/12/chartex" xmlns:cx7="http://schemas.microsoft.com/office/drawing/2016/5/13/chartex" xmlns:cx8="http://schemas.microsoft.com/office/drawing/2016/5/14/chartex" xmlns:mc="http://schemas.openxmlformats.org/markup-compatibility/2006" xmlns:m="http://schemas.openxmlformats.org/officeDocument/2006/math" xmlns:aink="http://schemas.microsoft.com/office/drawing/2016/ink" xmlns:am3d="http://schemas.microsoft.com/office/drawing/2017/model3d" xmlns:oel="http://schemas.microsoft.com/office/2019/extlst" xmlns:r="http://schemas.openxmlformats.org/officeDocument/2006/relationships" xmlns:wp14="http://schemas.microsoft.com/office/word/2010/wordprocessingDrawing" xmlns:wp="http://schemas.openxmlformats.org/drawingml/2006/wordprocessingDrawing" xmlns:wpg="http://schemas.microsoft.com/office/word/2010/wordprocessingGroup" xmlns:wpi="http://schemas.microsoft.com/office/word/2010/wordprocessingInk" xmlns:wps="http://schemas.microsoft.com/office/word/2010/wordprocessingShape" xmlns:o="urn:schemas-microsoft-com:office:office" xmlns:v="urn:schemas-microsoft-com:vml" xmlns:w10="urn:schemas-microsoft-com:office:word" xmlns:w="http://schemas.openxmlformats.org/wordprocessingml/2006/main" xmlns:w14="http://schemas.microsoft.com/office/word/2010/wordml" xmlns:w15="http://schemas.microsoft.com/office/word/2012/wordml" xmlns:w16cex="http://schemas.microsoft.com/office/word/2018/wordml/cex" xmlns:w16cid="http://schemas.microsoft.com/office/word/2016/wordml/cid" xmlns:w16="http://schemas.microsoft.com/office/word/2018/wordml" xmlns:w16sdtdh="http://schemas.microsoft.com/office/word/2020/wordml/sdtdatahash" xmlns:w16sdtfl="http://schemas.microsoft.com/office/word/2024/wordml/sdtformatlock" xmlns:w16se="http://schemas.microsoft.com/office/word/2015/wordml/symex" xmlns:w16du="http://schemas.microsoft.com/office/word/2023/wordml/word16du" xmlns:wne="http://schemas.microsoft.com/office/word/2006/wordml" mc:Ignorable="w14 w15 w16se w16cid w16 w16cex w16sdtdh w16sdtfl w16du wp14">
   <w:footnote w:type="separator" w:id="-1">
     <w:p>
       <w:r>
@@ -3121,7 +3133,7 @@
 </file>
 
 <file path=word/numbering.xml><?xml version="1.0" encoding="utf-8"?>
-<w:numbering xmlns:wpc="http://schemas.microsoft.com/office/word/2010/wordprocessingCanvas" xmlns:cx="http://schemas.microsoft.com/office/drawing/2014/chartex" xmlns:cx1="http://schemas.microsoft.com/office/drawing/2015/9/8/chartex" xmlns:cx2="http://schemas.microsoft.com/office/drawing/2015/10/21/chartex" xmlns:cx3="http://schemas.microsoft.com/office/drawing/2016/5/9/chartex" xmlns:cx4="http://schemas.microsoft.com/office/drawing/2016/5/10/chartex" xmlns:cx5="http://schemas.microsoft.com/office/drawing/2016/5/11/chartex" xmlns:cx6="http://schemas.microsoft.com/office/drawing/2016/5/12/chartex" xmlns:cx7="http://schemas.microsoft.com/office/drawing/2016/5/13/chartex" xmlns:cx8="http://schemas.microsoft.com/office/drawing/2016/5/14/chartex" xmlns:mc="http://schemas.openxmlformats.org/markup-compatibility/2006" xmlns:aink="http://schemas.microsoft.com/office/drawing/2016/ink" xmlns:am3d="http://schemas.microsoft.com/office/drawing/2017/model3d" xmlns:o="urn:schemas-microsoft-com:office:office" xmlns:oel="http://schemas.microsoft.com/office/2019/extlst" xmlns:r="http://schemas.openxmlformats.org/officeDocument/2006/relationships" xmlns:m="http://schemas.openxmlformats.org/officeDocument/2006/math" xmlns:v="urn:schemas-microsoft-com:vml" xmlns:wp14="http://schemas.microsoft.com/office/word/2010/wordprocessingDrawing" xmlns:wp="http://schemas.openxmlformats.org/drawingml/2006/wordprocessingDrawing" xmlns:w10="urn:schemas-microsoft-com:office:word" xmlns:w="http://schemas.openxmlformats.org/wordprocessingml/2006/main" xmlns:w14="http://schemas.microsoft.com/office/word/2010/wordml" xmlns:w15="http://schemas.microsoft.com/office/word/2012/wordml" xmlns:w16cex="http://schemas.microsoft.com/office/word/2018/wordml/cex" xmlns:w16cid="http://schemas.microsoft.com/office/word/2016/wordml/cid" xmlns:w16="http://schemas.microsoft.com/office/word/2018/wordml" xmlns:w16sdtdh="http://schemas.microsoft.com/office/word/2020/wordml/sdtdatahash" xmlns:w16se="http://schemas.microsoft.com/office/word/2015/wordml/symex" xmlns:wpg="http://schemas.microsoft.com/office/word/2010/wordprocessingGroup" xmlns:wpi="http://schemas.microsoft.com/office/word/2010/wordprocessingInk" xmlns:wne="http://schemas.microsoft.com/office/word/2006/wordml" xmlns:wps="http://schemas.microsoft.com/office/word/2010/wordprocessingShape" mc:Ignorable="w14 w15 w16se w16cid w16 w16cex w16sdtdh wp14">
+<w:numbering xmlns:wpc="http://schemas.microsoft.com/office/word/2010/wordprocessingCanvas" xmlns:cx="http://schemas.microsoft.com/office/drawing/2014/chartex" xmlns:cx1="http://schemas.microsoft.com/office/drawing/2015/9/8/chartex" xmlns:cx2="http://schemas.microsoft.com/office/drawing/2015/10/21/chartex" xmlns:cx3="http://schemas.microsoft.com/office/drawing/2016/5/9/chartex" xmlns:cx4="http://schemas.microsoft.com/office/drawing/2016/5/10/chartex" xmlns:cx5="http://schemas.microsoft.com/office/drawing/2016/5/11/chartex" xmlns:cx6="http://schemas.microsoft.com/office/drawing/2016/5/12/chartex" xmlns:cx7="http://schemas.microsoft.com/office/drawing/2016/5/13/chartex" xmlns:cx8="http://schemas.microsoft.com/office/drawing/2016/5/14/chartex" xmlns:mc="http://schemas.openxmlformats.org/markup-compatibility/2006" xmlns:m="http://schemas.openxmlformats.org/officeDocument/2006/math" xmlns:aink="http://schemas.microsoft.com/office/drawing/2016/ink" xmlns:am3d="http://schemas.microsoft.com/office/drawing/2017/model3d" xmlns:oel="http://schemas.microsoft.com/office/2019/extlst" xmlns:r="http://schemas.openxmlformats.org/officeDocument/2006/relationships" xmlns:wp14="http://schemas.microsoft.com/office/word/2010/wordprocessingDrawing" xmlns:wp="http://schemas.openxmlformats.org/drawingml/2006/wordprocessingDrawing" xmlns:wpg="http://schemas.microsoft.com/office/word/2010/wordprocessingGroup" xmlns:wpi="http://schemas.microsoft.com/office/word/2010/wordprocessingInk" xmlns:wps="http://schemas.microsoft.com/office/word/2010/wordprocessingShape" xmlns:o="urn:schemas-microsoft-com:office:office" xmlns:v="urn:schemas-microsoft-com:vml" xmlns:w10="urn:schemas-microsoft-com:office:word" xmlns:w="http://schemas.openxmlformats.org/wordprocessingml/2006/main" xmlns:w14="http://schemas.microsoft.com/office/word/2010/wordml" xmlns:w15="http://schemas.microsoft.com/office/word/2012/wordml" xmlns:w16cex="http://schemas.microsoft.com/office/word/2018/wordml/cex" xmlns:w16cid="http://schemas.microsoft.com/office/word/2016/wordml/cid" xmlns:w16="http://schemas.microsoft.com/office/word/2018/wordml" xmlns:w16sdtdh="http://schemas.microsoft.com/office/word/2020/wordml/sdtdatahash" xmlns:w16sdtfl="http://schemas.microsoft.com/office/word/2024/wordml/sdtformatlock" xmlns:w16se="http://schemas.microsoft.com/office/word/2015/wordml/symex" xmlns:w16du="http://schemas.microsoft.com/office/word/2023/wordml/word16du" xmlns:wne="http://schemas.microsoft.com/office/word/2006/wordml" mc:Ignorable="w14 w15 w16se w16cid w16 w16cex w16sdtdh w16sdtfl w16du wp14">
   <w:abstractNum w:abstractNumId="0" w15:restartNumberingAfterBreak="0">
     <w:nsid w:val="111D45EE"/>
     <w:multiLevelType w:val="hybridMultilevel"/>
@@ -4549,7 +4561,7 @@
 </file>
 
 <file path=word/styles.xml><?xml version="1.0" encoding="utf-8"?>
-<w:styles xmlns:mc="http://schemas.openxmlformats.org/markup-compatibility/2006" xmlns:r="http://schemas.openxmlformats.org/officeDocument/2006/relationships" xmlns:w="http://schemas.openxmlformats.org/wordprocessingml/2006/main" xmlns:w14="http://schemas.microsoft.com/office/word/2010/wordml" xmlns:w15="http://schemas.microsoft.com/office/word/2012/wordml" xmlns:w16cex="http://schemas.microsoft.com/office/word/2018/wordml/cex" xmlns:w16cid="http://schemas.microsoft.com/office/word/2016/wordml/cid" xmlns:w16="http://schemas.microsoft.com/office/word/2018/wordml" xmlns:w16sdtdh="http://schemas.microsoft.com/office/word/2020/wordml/sdtdatahash" xmlns:w16se="http://schemas.microsoft.com/office/word/2015/wordml/symex" mc:Ignorable="w14 w15 w16se w16cid w16 w16cex w16sdtdh">
+<w:styles xmlns:mc="http://schemas.openxmlformats.org/markup-compatibility/2006" xmlns:r="http://schemas.openxmlformats.org/officeDocument/2006/relationships" xmlns:w="http://schemas.openxmlformats.org/wordprocessingml/2006/main" xmlns:w14="http://schemas.microsoft.com/office/word/2010/wordml" xmlns:w15="http://schemas.microsoft.com/office/word/2012/wordml" xmlns:w16cex="http://schemas.microsoft.com/office/word/2018/wordml/cex" xmlns:w16cid="http://schemas.microsoft.com/office/word/2016/wordml/cid" xmlns:w16="http://schemas.microsoft.com/office/word/2018/wordml" xmlns:w16sdtdh="http://schemas.microsoft.com/office/word/2020/wordml/sdtdatahash" xmlns:w16sdtfl="http://schemas.microsoft.com/office/word/2024/wordml/sdtformatlock" xmlns:w16se="http://schemas.microsoft.com/office/word/2015/wordml/symex" xmlns:w16du="http://schemas.microsoft.com/office/word/2023/wordml/word16du" mc:Ignorable="w14 w15 w16se w16cid w16 w16cex w16sdtdh w16sdtfl w16du">
   <w:docDefaults>
     <w:rPrDefault>
       <w:rPr>

</xml_diff>

<commit_message>
cilium and tetragon in CV
</commit_message>
<xml_diff>
--- a/CV/Resume_khabir_sec.docx
+++ b/CV/Resume_khabir_sec.docx
@@ -2344,14 +2344,49 @@
         <w:rPr>
           <w:rStyle w:val="None"/>
           <w:rFonts w:ascii="Comic Sans MS" w:hAnsi="Comic Sans MS"/>
+          <w:b/>
+          <w:bCs/>
+          <w:spacing w:val="-5"/>
+          <w:sz w:val="20"/>
+          <w:szCs w:val="20"/>
+        </w:rPr>
+        <w:t>, Kubernetes, Docker</w:t>
+      </w:r>
+      <w:r>
+        <w:rPr>
+          <w:rStyle w:val="None"/>
+          <w:rFonts w:ascii="Comic Sans MS" w:hAnsi="Comic Sans MS"/>
           <w:spacing w:val="-5"/>
           <w:sz w:val="20"/>
           <w:szCs w:val="20"/>
         </w:rPr>
         <w:t xml:space="preserve"> and networking using </w:t>
       </w:r>
+      <w:r>
+        <w:rPr>
+          <w:rStyle w:val="None"/>
+          <w:rFonts w:ascii="Comic Sans MS" w:hAnsi="Comic Sans MS"/>
+          <w:b/>
+          <w:bCs/>
+          <w:spacing w:val="-5"/>
+          <w:sz w:val="20"/>
+          <w:szCs w:val="20"/>
+        </w:rPr>
+        <w:t>Cilium</w:t>
+      </w:r>
+      <w:r>
+        <w:rPr>
+          <w:rStyle w:val="None"/>
+          <w:rFonts w:ascii="Comic Sans MS" w:hAnsi="Comic Sans MS"/>
+          <w:b/>
+          <w:bCs/>
+          <w:spacing w:val="-5"/>
+          <w:sz w:val="20"/>
+          <w:szCs w:val="20"/>
+        </w:rPr>
+        <w:t xml:space="preserve"> (</w:t>
+      </w:r>
       <w:proofErr w:type="spellStart"/>
-      <w:proofErr w:type="gramStart"/>
       <w:r>
         <w:rPr>
           <w:rStyle w:val="None"/>
@@ -2362,44 +2397,42 @@
           <w:sz w:val="20"/>
           <w:szCs w:val="20"/>
         </w:rPr>
-        <w:t>Docker</w:t>
-      </w:r>
+        <w:t>eBPF</w:t>
+      </w:r>
+      <w:proofErr w:type="spellEnd"/>
       <w:r>
         <w:rPr>
           <w:rStyle w:val="None"/>
           <w:rFonts w:ascii="Comic Sans MS" w:hAnsi="Comic Sans MS"/>
           <w:b/>
-          <w:spacing w:val="-5"/>
-          <w:sz w:val="20"/>
-          <w:szCs w:val="20"/>
-        </w:rPr>
-        <w:t>,lxc</w:t>
-      </w:r>
-      <w:proofErr w:type="spellEnd"/>
-      <w:proofErr w:type="gramEnd"/>
+          <w:bCs/>
+          <w:spacing w:val="-5"/>
+          <w:sz w:val="20"/>
+          <w:szCs w:val="20"/>
+        </w:rPr>
+        <w:t xml:space="preserve"> </w:t>
+      </w:r>
       <w:r>
         <w:rPr>
           <w:rStyle w:val="None"/>
           <w:rFonts w:ascii="Comic Sans MS" w:hAnsi="Comic Sans MS"/>
-          <w:b/>
-          <w:spacing w:val="-5"/>
-          <w:sz w:val="20"/>
-          <w:szCs w:val="20"/>
-        </w:rPr>
-        <w:t>/</w:t>
-      </w:r>
-      <w:proofErr w:type="spellStart"/>
-      <w:proofErr w:type="gramStart"/>
+          <w:spacing w:val="-5"/>
+          <w:sz w:val="20"/>
+          <w:szCs w:val="20"/>
+        </w:rPr>
+        <w:t>based</w:t>
+      </w:r>
       <w:r>
         <w:rPr>
           <w:rStyle w:val="None"/>
           <w:rFonts w:ascii="Comic Sans MS" w:hAnsi="Comic Sans MS"/>
           <w:b/>
-          <w:spacing w:val="-5"/>
-          <w:sz w:val="20"/>
-          <w:szCs w:val="20"/>
-        </w:rPr>
-        <w:t>lxd</w:t>
+          <w:bCs/>
+          <w:spacing w:val="-5"/>
+          <w:sz w:val="20"/>
+          <w:szCs w:val="20"/>
+        </w:rPr>
+        <w:t>)</w:t>
       </w:r>
       <w:r>
         <w:rPr>
@@ -2409,7 +2442,7 @@
           <w:sz w:val="20"/>
           <w:szCs w:val="20"/>
         </w:rPr>
-        <w:t>,</w:t>
+        <w:t xml:space="preserve"> and </w:t>
       </w:r>
       <w:r>
         <w:rPr>
@@ -2421,10 +2454,88 @@
           <w:sz w:val="20"/>
           <w:szCs w:val="20"/>
         </w:rPr>
-        <w:t>Incus</w:t>
-      </w:r>
-      <w:proofErr w:type="spellEnd"/>
-      <w:proofErr w:type="gramEnd"/>
+        <w:t>Security</w:t>
+      </w:r>
+      <w:r>
+        <w:rPr>
+          <w:rStyle w:val="None"/>
+          <w:rFonts w:ascii="Comic Sans MS" w:hAnsi="Comic Sans MS"/>
+          <w:spacing w:val="-5"/>
+          <w:sz w:val="20"/>
+          <w:szCs w:val="20"/>
+        </w:rPr>
+        <w:t xml:space="preserve"> by </w:t>
+      </w:r>
+      <w:r>
+        <w:rPr>
+          <w:rStyle w:val="None"/>
+          <w:rFonts w:ascii="Comic Sans MS" w:hAnsi="Comic Sans MS"/>
+          <w:b/>
+          <w:bCs/>
+          <w:spacing w:val="-5"/>
+          <w:sz w:val="20"/>
+          <w:szCs w:val="20"/>
+        </w:rPr>
+        <w:t>Tetragon</w:t>
+      </w:r>
+      <w:r>
+        <w:rPr>
+          <w:rStyle w:val="None"/>
+          <w:rFonts w:ascii="Comic Sans MS" w:hAnsi="Comic Sans MS"/>
+          <w:b/>
+          <w:bCs/>
+          <w:spacing w:val="-5"/>
+          <w:sz w:val="20"/>
+          <w:szCs w:val="20"/>
+        </w:rPr>
+        <w:t xml:space="preserve"> (</w:t>
+      </w:r>
+      <w:r>
+        <w:rPr>
+          <w:rStyle w:val="None"/>
+          <w:rFonts w:ascii="Comic Sans MS" w:hAnsi="Comic Sans MS"/>
+          <w:b/>
+          <w:bCs/>
+          <w:spacing w:val="-5"/>
+          <w:sz w:val="20"/>
+          <w:szCs w:val="20"/>
+        </w:rPr>
+        <w:t>e</w:t>
+      </w:r>
+      <w:r>
+        <w:rPr>
+          <w:rStyle w:val="None"/>
+          <w:rFonts w:ascii="Comic Sans MS" w:hAnsi="Comic Sans MS"/>
+          <w:b/>
+          <w:bCs/>
+          <w:spacing w:val="-5"/>
+          <w:sz w:val="20"/>
+          <w:szCs w:val="20"/>
+        </w:rPr>
+        <w:t xml:space="preserve">BPF </w:t>
+      </w:r>
+      <w:r>
+        <w:rPr>
+          <w:rStyle w:val="None"/>
+          <w:rFonts w:ascii="Comic Sans MS" w:hAnsi="Comic Sans MS"/>
+          <w:spacing w:val="-5"/>
+          <w:sz w:val="20"/>
+          <w:szCs w:val="20"/>
+        </w:rPr>
+        <w:t>based</w:t>
+      </w:r>
+      <w:r>
+        <w:rPr>
+          <w:rStyle w:val="None"/>
+          <w:rFonts w:ascii="Comic Sans MS" w:hAnsi="Comic Sans MS"/>
+          <w:b/>
+          <w:bCs/>
+          <w:spacing w:val="-5"/>
+          <w:sz w:val="20"/>
+          <w:szCs w:val="20"/>
+        </w:rPr>
+        <w:t>)</w:t>
+      </w:r>
       <w:r>
         <w:rPr>
           <w:rStyle w:val="None"/>

</xml_diff>